<commit_message>
simplenotification with EFCORE with screenshot
</commit_message>
<xml_diff>
--- a/Day 14 May 13/SimpleNotificationSystem/Vaibhav_Gupta_EF_in_3T_Assignment.docx
+++ b/Day 14 May 13/SimpleNotificationSystem/Vaibhav_Gupta_EF_in_3T_Assignment.docx
@@ -9,14 +9,22 @@
       </w:r>
       <w:proofErr w:type="spellEnd"/>
       <w:r>
-        <w:t xml:space="preserve"> Link: Link</w:t>
-      </w:r>
+        <w:t xml:space="preserve"> Link: </w:t>
+      </w:r>
+      <w:hyperlink r:id="rId4" w:history="1">
+        <w:r>
+          <w:rPr>
+            <w:rStyle w:val="Hyperlink"/>
+          </w:rPr>
+          <w:t>Link</w:t>
+        </w:r>
+      </w:hyperlink>
     </w:p>
     <w:p>
       <w:r>
         <w:t>Vaibhav Gupta(</w:t>
       </w:r>
-      <w:hyperlink r:id="rId4" w:history="1">
+      <w:hyperlink r:id="rId5" w:history="1">
         <w:r>
           <w:rPr>
             <w:rStyle w:val="Hyperlink"/>
@@ -26,6 +34,11 @@
       </w:hyperlink>
       <w:r>
         <w:t>)</w:t>
+      </w:r>
+    </w:p>
+    <w:p>
+      <w:r>
+        <w:t>https://github.com/114-Vaibhav/genspark/tree/main/Day%2014%20May%2013/SimpleNotificationSystem</w:t>
       </w:r>
     </w:p>
     <w:p>
@@ -44,46 +57,6 @@
                 <pic:pic xmlns:pic="http://schemas.openxmlformats.org/drawingml/2006/picture">
                   <pic:nvPicPr>
                     <pic:cNvPr id="1324286948" name=""/>
-                    <pic:cNvPicPr/>
-                  </pic:nvPicPr>
-                  <pic:blipFill>
-                    <a:blip r:embed="rId5"/>
-                    <a:stretch>
-                      <a:fillRect/>
-                    </a:stretch>
-                  </pic:blipFill>
-                  <pic:spPr>
-                    <a:xfrm>
-                      <a:off x="0" y="0"/>
-                      <a:ext cx="5943600" cy="8074025"/>
-                    </a:xfrm>
-                    <a:prstGeom prst="rect">
-                      <a:avLst/>
-                    </a:prstGeom>
-                  </pic:spPr>
-                </pic:pic>
-              </a:graphicData>
-            </a:graphic>
-          </wp:inline>
-        </w:drawing>
-      </w:r>
-    </w:p>
-    <w:p>
-      <w:r>
-        <w:lastRenderedPageBreak/>
-        <w:drawing>
-          <wp:inline distT="0" distB="0" distL="0" distR="0" wp14:anchorId="244AE201" wp14:editId="586202E0">
-            <wp:extent cx="5943600" cy="8074025"/>
-            <wp:effectExtent l="0" t="0" r="0" b="3175"/>
-            <wp:docPr id="1279956113" name="Picture 1"/>
-            <wp:cNvGraphicFramePr>
-              <a:graphicFrameLocks xmlns:a="http://schemas.openxmlformats.org/drawingml/2006/main" noChangeAspect="1"/>
-            </wp:cNvGraphicFramePr>
-            <a:graphic xmlns:a="http://schemas.openxmlformats.org/drawingml/2006/main">
-              <a:graphicData uri="http://schemas.openxmlformats.org/drawingml/2006/picture">
-                <pic:pic xmlns:pic="http://schemas.openxmlformats.org/drawingml/2006/picture">
-                  <pic:nvPicPr>
-                    <pic:cNvPr id="1279956113" name=""/>
                     <pic:cNvPicPr/>
                   </pic:nvPicPr>
                   <pic:blipFill>
@@ -107,19 +80,15 @@
           </wp:inline>
         </w:drawing>
       </w:r>
-      <w:r>
-        <w:rPr>
-          <w:noProof/>
-        </w:rPr>
-        <w:t xml:space="preserve"> </w:t>
-      </w:r>
+    </w:p>
+    <w:p>
       <w:r>
         <w:lastRenderedPageBreak/>
         <w:drawing>
-          <wp:inline distT="0" distB="0" distL="0" distR="0" wp14:anchorId="31A56A77" wp14:editId="72E93DE5">
+          <wp:inline distT="0" distB="0" distL="0" distR="0" wp14:anchorId="244AE201" wp14:editId="586202E0">
             <wp:extent cx="5943600" cy="8074025"/>
             <wp:effectExtent l="0" t="0" r="0" b="3175"/>
-            <wp:docPr id="1595007851" name="Picture 1"/>
+            <wp:docPr id="1279956113" name="Picture 1"/>
             <wp:cNvGraphicFramePr>
               <a:graphicFrameLocks xmlns:a="http://schemas.openxmlformats.org/drawingml/2006/main" noChangeAspect="1"/>
             </wp:cNvGraphicFramePr>
@@ -127,7 +96,7 @@
               <a:graphicData uri="http://schemas.openxmlformats.org/drawingml/2006/picture">
                 <pic:pic xmlns:pic="http://schemas.openxmlformats.org/drawingml/2006/picture">
                   <pic:nvPicPr>
-                    <pic:cNvPr id="1595007851" name=""/>
+                    <pic:cNvPr id="1279956113" name=""/>
                     <pic:cNvPicPr/>
                   </pic:nvPicPr>
                   <pic:blipFill>
@@ -158,15 +127,12 @@
         <w:t xml:space="preserve"> </w:t>
       </w:r>
       <w:r>
-        <w:rPr>
-          <w:noProof/>
-        </w:rPr>
         <w:lastRenderedPageBreak/>
         <w:drawing>
-          <wp:inline distT="0" distB="0" distL="0" distR="0" wp14:anchorId="2D864CA9" wp14:editId="06F97B4C">
+          <wp:inline distT="0" distB="0" distL="0" distR="0" wp14:anchorId="31A56A77" wp14:editId="72E93DE5">
             <wp:extent cx="5943600" cy="8074025"/>
             <wp:effectExtent l="0" t="0" r="0" b="3175"/>
-            <wp:docPr id="1810261109" name="Picture 1"/>
+            <wp:docPr id="1595007851" name="Picture 1"/>
             <wp:cNvGraphicFramePr>
               <a:graphicFrameLocks xmlns:a="http://schemas.openxmlformats.org/drawingml/2006/main" noChangeAspect="1"/>
             </wp:cNvGraphicFramePr>
@@ -174,7 +140,7 @@
               <a:graphicData uri="http://schemas.openxmlformats.org/drawingml/2006/picture">
                 <pic:pic xmlns:pic="http://schemas.openxmlformats.org/drawingml/2006/picture">
                   <pic:nvPicPr>
-                    <pic:cNvPr id="1810261109" name=""/>
+                    <pic:cNvPr id="1595007851" name=""/>
                     <pic:cNvPicPr/>
                   </pic:nvPicPr>
                   <pic:blipFill>
@@ -210,6 +176,53 @@
         </w:rPr>
         <w:lastRenderedPageBreak/>
         <w:drawing>
+          <wp:inline distT="0" distB="0" distL="0" distR="0" wp14:anchorId="2D864CA9" wp14:editId="06F97B4C">
+            <wp:extent cx="5943600" cy="8074025"/>
+            <wp:effectExtent l="0" t="0" r="0" b="3175"/>
+            <wp:docPr id="1810261109" name="Picture 1"/>
+            <wp:cNvGraphicFramePr>
+              <a:graphicFrameLocks xmlns:a="http://schemas.openxmlformats.org/drawingml/2006/main" noChangeAspect="1"/>
+            </wp:cNvGraphicFramePr>
+            <a:graphic xmlns:a="http://schemas.openxmlformats.org/drawingml/2006/main">
+              <a:graphicData uri="http://schemas.openxmlformats.org/drawingml/2006/picture">
+                <pic:pic xmlns:pic="http://schemas.openxmlformats.org/drawingml/2006/picture">
+                  <pic:nvPicPr>
+                    <pic:cNvPr id="1810261109" name=""/>
+                    <pic:cNvPicPr/>
+                  </pic:nvPicPr>
+                  <pic:blipFill>
+                    <a:blip r:embed="rId9"/>
+                    <a:stretch>
+                      <a:fillRect/>
+                    </a:stretch>
+                  </pic:blipFill>
+                  <pic:spPr>
+                    <a:xfrm>
+                      <a:off x="0" y="0"/>
+                      <a:ext cx="5943600" cy="8074025"/>
+                    </a:xfrm>
+                    <a:prstGeom prst="rect">
+                      <a:avLst/>
+                    </a:prstGeom>
+                  </pic:spPr>
+                </pic:pic>
+              </a:graphicData>
+            </a:graphic>
+          </wp:inline>
+        </w:drawing>
+      </w:r>
+      <w:r>
+        <w:rPr>
+          <w:noProof/>
+        </w:rPr>
+        <w:t xml:space="preserve"> </w:t>
+      </w:r>
+      <w:r>
+        <w:rPr>
+          <w:noProof/>
+        </w:rPr>
+        <w:lastRenderedPageBreak/>
+        <w:drawing>
           <wp:inline distT="0" distB="0" distL="0" distR="0" wp14:anchorId="7F6E7BAC" wp14:editId="49155D16">
             <wp:extent cx="5943600" cy="6779260"/>
             <wp:effectExtent l="0" t="0" r="0" b="2540"/>
@@ -222,53 +235,6 @@
                 <pic:pic xmlns:pic="http://schemas.openxmlformats.org/drawingml/2006/picture">
                   <pic:nvPicPr>
                     <pic:cNvPr id="727778471" name=""/>
-                    <pic:cNvPicPr/>
-                  </pic:nvPicPr>
-                  <pic:blipFill>
-                    <a:blip r:embed="rId9"/>
-                    <a:stretch>
-                      <a:fillRect/>
-                    </a:stretch>
-                  </pic:blipFill>
-                  <pic:spPr>
-                    <a:xfrm>
-                      <a:off x="0" y="0"/>
-                      <a:ext cx="5943600" cy="6779260"/>
-                    </a:xfrm>
-                    <a:prstGeom prst="rect">
-                      <a:avLst/>
-                    </a:prstGeom>
-                  </pic:spPr>
-                </pic:pic>
-              </a:graphicData>
-            </a:graphic>
-          </wp:inline>
-        </w:drawing>
-      </w:r>
-      <w:r>
-        <w:rPr>
-          <w:noProof/>
-        </w:rPr>
-        <w:t xml:space="preserve"> </w:t>
-      </w:r>
-      <w:r>
-        <w:rPr>
-          <w:noProof/>
-        </w:rPr>
-        <w:lastRenderedPageBreak/>
-        <w:drawing>
-          <wp:inline distT="0" distB="0" distL="0" distR="0" wp14:anchorId="71C58C59" wp14:editId="17118557">
-            <wp:extent cx="5943600" cy="6779260"/>
-            <wp:effectExtent l="0" t="0" r="0" b="2540"/>
-            <wp:docPr id="72727260" name="Picture 1"/>
-            <wp:cNvGraphicFramePr>
-              <a:graphicFrameLocks xmlns:a="http://schemas.openxmlformats.org/drawingml/2006/main" noChangeAspect="1"/>
-            </wp:cNvGraphicFramePr>
-            <a:graphic xmlns:a="http://schemas.openxmlformats.org/drawingml/2006/main">
-              <a:graphicData uri="http://schemas.openxmlformats.org/drawingml/2006/picture">
-                <pic:pic xmlns:pic="http://schemas.openxmlformats.org/drawingml/2006/picture">
-                  <pic:nvPicPr>
-                    <pic:cNvPr id="72727260" name=""/>
                     <pic:cNvPicPr/>
                   </pic:nvPicPr>
                   <pic:blipFill>
@@ -304,10 +270,10 @@
         </w:rPr>
         <w:lastRenderedPageBreak/>
         <w:drawing>
-          <wp:inline distT="0" distB="0" distL="0" distR="0" wp14:anchorId="5FF1158D" wp14:editId="2136AC9F">
+          <wp:inline distT="0" distB="0" distL="0" distR="0" wp14:anchorId="71C58C59" wp14:editId="17118557">
             <wp:extent cx="5943600" cy="6779260"/>
             <wp:effectExtent l="0" t="0" r="0" b="2540"/>
-            <wp:docPr id="1468725818" name="Picture 1"/>
+            <wp:docPr id="72727260" name="Picture 1"/>
             <wp:cNvGraphicFramePr>
               <a:graphicFrameLocks xmlns:a="http://schemas.openxmlformats.org/drawingml/2006/main" noChangeAspect="1"/>
             </wp:cNvGraphicFramePr>
@@ -315,7 +281,7 @@
               <a:graphicData uri="http://schemas.openxmlformats.org/drawingml/2006/picture">
                 <pic:pic xmlns:pic="http://schemas.openxmlformats.org/drawingml/2006/picture">
                   <pic:nvPicPr>
-                    <pic:cNvPr id="1468725818" name=""/>
+                    <pic:cNvPr id="72727260" name=""/>
                     <pic:cNvPicPr/>
                   </pic:nvPicPr>
                   <pic:blipFill>
@@ -351,6 +317,53 @@
         </w:rPr>
         <w:lastRenderedPageBreak/>
         <w:drawing>
+          <wp:inline distT="0" distB="0" distL="0" distR="0" wp14:anchorId="5FF1158D" wp14:editId="2136AC9F">
+            <wp:extent cx="5943600" cy="6779260"/>
+            <wp:effectExtent l="0" t="0" r="0" b="2540"/>
+            <wp:docPr id="1468725818" name="Picture 1"/>
+            <wp:cNvGraphicFramePr>
+              <a:graphicFrameLocks xmlns:a="http://schemas.openxmlformats.org/drawingml/2006/main" noChangeAspect="1"/>
+            </wp:cNvGraphicFramePr>
+            <a:graphic xmlns:a="http://schemas.openxmlformats.org/drawingml/2006/main">
+              <a:graphicData uri="http://schemas.openxmlformats.org/drawingml/2006/picture">
+                <pic:pic xmlns:pic="http://schemas.openxmlformats.org/drawingml/2006/picture">
+                  <pic:nvPicPr>
+                    <pic:cNvPr id="1468725818" name=""/>
+                    <pic:cNvPicPr/>
+                  </pic:nvPicPr>
+                  <pic:blipFill>
+                    <a:blip r:embed="rId12"/>
+                    <a:stretch>
+                      <a:fillRect/>
+                    </a:stretch>
+                  </pic:blipFill>
+                  <pic:spPr>
+                    <a:xfrm>
+                      <a:off x="0" y="0"/>
+                      <a:ext cx="5943600" cy="6779260"/>
+                    </a:xfrm>
+                    <a:prstGeom prst="rect">
+                      <a:avLst/>
+                    </a:prstGeom>
+                  </pic:spPr>
+                </pic:pic>
+              </a:graphicData>
+            </a:graphic>
+          </wp:inline>
+        </w:drawing>
+      </w:r>
+      <w:r>
+        <w:rPr>
+          <w:noProof/>
+        </w:rPr>
+        <w:t xml:space="preserve"> </w:t>
+      </w:r>
+      <w:r>
+        <w:rPr>
+          <w:noProof/>
+        </w:rPr>
+        <w:lastRenderedPageBreak/>
+        <w:drawing>
           <wp:inline distT="0" distB="0" distL="0" distR="0" wp14:anchorId="5DB2E089" wp14:editId="7DA6CD1E">
             <wp:extent cx="5943600" cy="6779260"/>
             <wp:effectExtent l="0" t="0" r="0" b="2540"/>
@@ -366,7 +379,7 @@
                     <pic:cNvPicPr/>
                   </pic:nvPicPr>
                   <pic:blipFill>
-                    <a:blip r:embed="rId12"/>
+                    <a:blip r:embed="rId13"/>
                     <a:stretch>
                       <a:fillRect/>
                     </a:stretch>

</xml_diff>